<commit_message>
Writeup: add evaluation rigor section with audit verification table
</commit_message>
<xml_diff>
--- a/FN_WriteUp_Musil_Jiri_ITAI2376.docx
+++ b/FN_WriteUp_Musil_Jiri_ITAI2376.docx
@@ -111,7 +111,7 @@
         <w:jc w:val="left"/>
       </w:pPr>
       <w:r>
-        <w:t xml:space="preserve">The framework choice changed from the midterm blueprint. I committed to CrewAI plus Claude Sonnet as the agent brain. I built that path (it works, lives in </w:t>
+        <w:t xml:space="preserve">The framework choice changed from the midterm blueprint. I committed to CrewAI plus a hosted LLM as the agent brain. I built that path (it works, lives in </w:t>
       </w:r>
       <w:r>
         <w:rPr>
@@ -131,7 +131,7 @@
         <w:t>brain.py</w:t>
       </w:r>
       <w:r>
-        <w:t>. The reason is the same reason I take this project seriously at work: workforce planning decisions are audited, regulated, and contestable. Every "do not advance" recommendation can be challenged on bias grounds, and the EU AI Act treats HR systems as high risk for a reason. An LLM brain produces fluent narratives that cannot explain in plain language what rule produced a specific verdict. A 20 cell decision matrix where every cell carries a named rule (R1 strong stable through R20 decline critical) and an explicit rationale can. CrewAI remains wired as the optional path for cases where free text generation actually adds value (resume coaching, drafting job descriptions, multi turn interview prep). For the actual hire and retention decisions this project solves, the LLM adds latency and cost without adding capability. Measured on the same joint hire scenario, the proprietary brain returns a memo in about 500 milliseconds; CrewAI plus Claude Sonnet 4 takes 15 to 30 seconds and roughly 0.03 to 0.10 dollars per memo.</w:t>
+        <w:t>. The reason is the same reason I take this project seriously at work: workforce planning decisions are audited, regulated, and contestable. Every "do not advance" recommendation can be challenged on bias grounds, and the EU AI Act treats HR systems as high risk for a reason. An LLM brain produces fluent narratives that cannot explain in plain language what rule produced a specific verdict. A 20 cell decision matrix where every cell carries a named rule (R1 strong stable through R20 decline critical) and an explicit rationale can. CrewAI remains wired as the optional path for cases where free text generation actually adds value (resume coaching, drafting job descriptions, multi turn interview prep). For the actual hire and retention decisions this project solves, the LLM adds latency and cost without adding capability. Measured on the same joint hire scenario, the proprietary brain returns a memo in about 500 milliseconds; the CrewAI path with a hosted LLM takes 15 to 30 seconds and roughly 0.03 to 0.10 dollars per memo.</w:t>
       </w:r>
     </w:p>
     <w:p>
@@ -638,7 +638,817 @@
         <w:spacing w:before="160" w:after="40"/>
       </w:pPr>
       <w:r>
-        <w:t>5. What worked, what did not, and the surprising thing I learned</w:t>
+        <w:t>5. Evaluation rigor and the adjudicated dev sidecar</w:t>
+      </w:r>
+    </w:p>
+    <w:p>
+      <w:pPr>
+        <w:spacing w:after="120"/>
+        <w:jc w:val="left"/>
+      </w:pPr>
+      <w:r>
+        <w:t xml:space="preserve">The held out dev set this project ships with is not a single point in time snapshot. It is a 25 document, 840 span canonical adjudicated sidecar that went through six pipeline phases (candidate review, repair overlay, quality preflight, tool and skill apply, metadata enrichment, canonical promotion) before landing under </w:t>
+      </w:r>
+      <w:r>
+        <w:rPr>
+          <w:rFonts w:ascii="Consolas" w:hAnsi="Consolas"/>
+          <w:sz w:val="20"/>
+        </w:rPr>
+        <w:t>data/processed/</w:t>
+      </w:r>
+      <w:r>
+        <w:t xml:space="preserve">. The full methodology is documented in </w:t>
+      </w:r>
+      <w:r>
+        <w:rPr>
+          <w:rFonts w:ascii="Consolas" w:hAnsi="Consolas"/>
+          <w:sz w:val="20"/>
+        </w:rPr>
+        <w:t>docs/EVAL_METHODOLOGY.md</w:t>
+      </w:r>
+      <w:r>
+        <w:t>. Every phase emits its own audit run with a handoff record, validation report, and provenance log. Frozen artifacts are locked read only on acceptance; no prior phase directory was mutated by any later phase.</w:t>
+      </w:r>
+    </w:p>
+    <w:p>
+      <w:pPr>
+        <w:spacing w:after="120"/>
+        <w:jc w:val="left"/>
+      </w:pPr>
+      <w:r>
+        <w:t>The pipeline aligns with the NIST AI Risk Management Framework's emphasis on test, evaluation, verification, and validation across the AI lifecycle, and with EU AI Act Article 14 on human oversight of high risk AI systems. Every span carries an explicit human review status. Of the 840 retained spans, 31 carry an explicit human override record (22 boundary expansions during repair overlay, one expand and drop conflict pair, two outer survivors of nested span resolution, five TOOL versus SKILL relabels during the policy apply phase, and one keep current with explicit blocker clearance during the payroll resolution phase). The remaining 809 carry a null override record because they passed the multi stage review pipeline default. The pipeline used model assisted annotation under human supervision; the human reviewer is the source of truth at every decision point. Production inference itself is fully local and does not depend on any remote model.</w:t>
+      </w:r>
+    </w:p>
+    <w:p>
+      <w:pPr>
+        <w:spacing w:after="120"/>
+        <w:jc w:val="left"/>
+      </w:pPr>
+      <w:r>
+        <w:t>The integrity check below is recomputable from the canonical sidecars as they ship in this submission. Every claimed value matches the actual file on disk.</w:t>
+      </w:r>
+    </w:p>
+    <w:tbl>
+      <w:tblPr>
+        <w:tblStyle w:val="LightGrid-Accent1"/>
+        <w:tblW w:type="auto" w:w="0"/>
+        <w:tblLayout w:type="autofit"/>
+        <w:tblLook w:firstColumn="1" w:firstRow="1" w:lastColumn="0" w:lastRow="0" w:noHBand="0" w:noVBand="1" w:val="04A0"/>
+      </w:tblPr>
+      <w:tblGrid>
+        <w:gridCol w:w="2340"/>
+        <w:gridCol w:w="2340"/>
+        <w:gridCol w:w="2340"/>
+        <w:gridCol w:w="2340"/>
+      </w:tblGrid>
+      <w:tr>
+        <w:tc>
+          <w:tcPr>
+            <w:tcW w:type="dxa" w:w="2340"/>
+          </w:tcPr>
+          <w:p>
+            <w:r/>
+            <w:r>
+              <w:rPr>
+                <w:b/>
+              </w:rPr>
+              <w:t>Check</w:t>
+            </w:r>
+          </w:p>
+        </w:tc>
+        <w:tc>
+          <w:tcPr>
+            <w:tcW w:type="dxa" w:w="2340"/>
+          </w:tcPr>
+          <w:p>
+            <w:r/>
+            <w:r>
+              <w:rPr>
+                <w:b/>
+              </w:rPr>
+              <w:t>Claimed</w:t>
+            </w:r>
+          </w:p>
+        </w:tc>
+        <w:tc>
+          <w:tcPr>
+            <w:tcW w:type="dxa" w:w="2340"/>
+          </w:tcPr>
+          <w:p>
+            <w:r/>
+            <w:r>
+              <w:rPr>
+                <w:b/>
+              </w:rPr>
+              <w:t>Actual</w:t>
+            </w:r>
+          </w:p>
+        </w:tc>
+        <w:tc>
+          <w:tcPr>
+            <w:tcW w:type="dxa" w:w="2340"/>
+          </w:tcPr>
+          <w:p>
+            <w:r/>
+            <w:r>
+              <w:rPr>
+                <w:b/>
+              </w:rPr>
+              <w:t>Match</w:t>
+            </w:r>
+          </w:p>
+        </w:tc>
+      </w:tr>
+      <w:tr>
+        <w:tc>
+          <w:tcPr>
+            <w:tcW w:type="dxa" w:w="2340"/>
+          </w:tcPr>
+          <w:p>
+            <w:r/>
+            <w:r>
+              <w:rPr>
+                <w:rFonts w:ascii="Consolas" w:hAnsi="Consolas"/>
+                <w:sz w:val="20"/>
+              </w:rPr>
+              <w:t>labels.json</w:t>
+            </w:r>
+            <w:r>
+              <w:t xml:space="preserve"> sha256</w:t>
+            </w:r>
+          </w:p>
+        </w:tc>
+        <w:tc>
+          <w:tcPr>
+            <w:tcW w:type="dxa" w:w="2340"/>
+          </w:tcPr>
+          <w:p>
+            <w:r/>
+            <w:r>
+              <w:t>4aa8f79c, 2,841,532 bytes</w:t>
+            </w:r>
+          </w:p>
+        </w:tc>
+        <w:tc>
+          <w:tcPr>
+            <w:tcW w:type="dxa" w:w="2340"/>
+          </w:tcPr>
+          <w:p>
+            <w:r/>
+            <w:r>
+              <w:t>4aa8f79c, 2,841,532 bytes</w:t>
+            </w:r>
+          </w:p>
+        </w:tc>
+        <w:tc>
+          <w:tcPr>
+            <w:tcW w:type="dxa" w:w="2340"/>
+          </w:tcPr>
+          <w:p>
+            <w:r/>
+            <w:r>
+              <w:t>yes</w:t>
+            </w:r>
+          </w:p>
+        </w:tc>
+      </w:tr>
+      <w:tr>
+        <w:tc>
+          <w:tcPr>
+            <w:tcW w:type="dxa" w:w="2340"/>
+          </w:tcPr>
+          <w:p>
+            <w:r/>
+            <w:r>
+              <w:rPr>
+                <w:rFonts w:ascii="Consolas" w:hAnsi="Consolas"/>
+                <w:sz w:val="20"/>
+              </w:rPr>
+              <w:t>provenance.jsonl</w:t>
+            </w:r>
+            <w:r>
+              <w:t xml:space="preserve"> sha256</w:t>
+            </w:r>
+          </w:p>
+        </w:tc>
+        <w:tc>
+          <w:tcPr>
+            <w:tcW w:type="dxa" w:w="2340"/>
+          </w:tcPr>
+          <w:p>
+            <w:r/>
+            <w:r>
+              <w:t>6dd14b1f, 2,115,664 bytes (840 lines)</w:t>
+            </w:r>
+          </w:p>
+        </w:tc>
+        <w:tc>
+          <w:tcPr>
+            <w:tcW w:type="dxa" w:w="2340"/>
+          </w:tcPr>
+          <w:p>
+            <w:r/>
+            <w:r>
+              <w:t>6dd14b1f, 2,115,664 bytes</w:t>
+            </w:r>
+          </w:p>
+        </w:tc>
+        <w:tc>
+          <w:tcPr>
+            <w:tcW w:type="dxa" w:w="2340"/>
+          </w:tcPr>
+          <w:p>
+            <w:r/>
+            <w:r>
+              <w:t>yes</w:t>
+            </w:r>
+          </w:p>
+        </w:tc>
+      </w:tr>
+      <w:tr>
+        <w:tc>
+          <w:tcPr>
+            <w:tcW w:type="dxa" w:w="2340"/>
+          </w:tcPr>
+          <w:p>
+            <w:r/>
+            <w:r>
+              <w:rPr>
+                <w:rFonts w:ascii="Consolas" w:hAnsi="Consolas"/>
+                <w:sz w:val="20"/>
+              </w:rPr>
+              <w:t>manifest.json</w:t>
+            </w:r>
+            <w:r>
+              <w:t xml:space="preserve"> sha256</w:t>
+            </w:r>
+          </w:p>
+        </w:tc>
+        <w:tc>
+          <w:tcPr>
+            <w:tcW w:type="dxa" w:w="2340"/>
+          </w:tcPr>
+          <w:p>
+            <w:r/>
+            <w:r>
+              <w:t>259fff16, 12,630 bytes</w:t>
+            </w:r>
+          </w:p>
+        </w:tc>
+        <w:tc>
+          <w:tcPr>
+            <w:tcW w:type="dxa" w:w="2340"/>
+          </w:tcPr>
+          <w:p>
+            <w:r/>
+            <w:r>
+              <w:t>259fff16, 12,630 bytes</w:t>
+            </w:r>
+          </w:p>
+        </w:tc>
+        <w:tc>
+          <w:tcPr>
+            <w:tcW w:type="dxa" w:w="2340"/>
+          </w:tcPr>
+          <w:p>
+            <w:r/>
+            <w:r>
+              <w:t>yes</w:t>
+            </w:r>
+          </w:p>
+        </w:tc>
+      </w:tr>
+      <w:tr>
+        <w:tc>
+          <w:tcPr>
+            <w:tcW w:type="dxa" w:w="2340"/>
+          </w:tcPr>
+          <w:p>
+            <w:r/>
+            <w:r>
+              <w:rPr>
+                <w:rFonts w:ascii="Consolas" w:hAnsi="Consolas"/>
+                <w:sz w:val="20"/>
+              </w:rPr>
+              <w:t>eval_dev_v1.json</w:t>
+            </w:r>
+            <w:r>
+              <w:t xml:space="preserve"> sha256 (input integrity)</w:t>
+            </w:r>
+          </w:p>
+        </w:tc>
+        <w:tc>
+          <w:tcPr>
+            <w:tcW w:type="dxa" w:w="2340"/>
+          </w:tcPr>
+          <w:p>
+            <w:r/>
+            <w:r>
+              <w:t>0b5a643f, 456,470 bytes</w:t>
+            </w:r>
+          </w:p>
+        </w:tc>
+        <w:tc>
+          <w:tcPr>
+            <w:tcW w:type="dxa" w:w="2340"/>
+          </w:tcPr>
+          <w:p>
+            <w:r/>
+            <w:r>
+              <w:t>0b5a643f, 456,470 bytes</w:t>
+            </w:r>
+          </w:p>
+        </w:tc>
+        <w:tc>
+          <w:tcPr>
+            <w:tcW w:type="dxa" w:w="2340"/>
+          </w:tcPr>
+          <w:p>
+            <w:r/>
+            <w:r>
+              <w:t>yes</w:t>
+            </w:r>
+          </w:p>
+        </w:tc>
+      </w:tr>
+      <w:tr>
+        <w:tc>
+          <w:tcPr>
+            <w:tcW w:type="dxa" w:w="2340"/>
+          </w:tcPr>
+          <w:p>
+            <w:r/>
+            <w:r>
+              <w:t>Record and line counts</w:t>
+            </w:r>
+          </w:p>
+        </w:tc>
+        <w:tc>
+          <w:tcPr>
+            <w:tcW w:type="dxa" w:w="2340"/>
+          </w:tcPr>
+          <w:p>
+            <w:r/>
+            <w:r>
+              <w:t>840 records, 840 provenance lines, 25 docs</w:t>
+            </w:r>
+          </w:p>
+        </w:tc>
+        <w:tc>
+          <w:tcPr>
+            <w:tcW w:type="dxa" w:w="2340"/>
+          </w:tcPr>
+          <w:p>
+            <w:r/>
+            <w:r>
+              <w:t>840 / 840 / 25</w:t>
+            </w:r>
+          </w:p>
+        </w:tc>
+        <w:tc>
+          <w:tcPr>
+            <w:tcW w:type="dxa" w:w="2340"/>
+          </w:tcPr>
+          <w:p>
+            <w:r/>
+            <w:r>
+              <w:t>yes</w:t>
+            </w:r>
+          </w:p>
+        </w:tc>
+      </w:tr>
+      <w:tr>
+        <w:tc>
+          <w:tcPr>
+            <w:tcW w:type="dxa" w:w="2340"/>
+          </w:tcPr>
+          <w:p>
+            <w:r/>
+            <w:r>
+              <w:t>Per label totals (SKILL 311, TOOL 277, ...)</w:t>
+            </w:r>
+          </w:p>
+        </w:tc>
+        <w:tc>
+          <w:tcPr>
+            <w:tcW w:type="dxa" w:w="2340"/>
+          </w:tcPr>
+          <w:p>
+            <w:r/>
+            <w:r>
+              <w:t>sums to 840</w:t>
+            </w:r>
+          </w:p>
+        </w:tc>
+        <w:tc>
+          <w:tcPr>
+            <w:tcW w:type="dxa" w:w="2340"/>
+          </w:tcPr>
+          <w:p>
+            <w:r/>
+            <w:r>
+              <w:t>sums to 840</w:t>
+            </w:r>
+          </w:p>
+        </w:tc>
+        <w:tc>
+          <w:tcPr>
+            <w:tcW w:type="dxa" w:w="2340"/>
+          </w:tcPr>
+          <w:p>
+            <w:r/>
+            <w:r>
+              <w:t>yes</w:t>
+            </w:r>
+          </w:p>
+        </w:tc>
+      </w:tr>
+      <w:tr>
+        <w:tc>
+          <w:tcPr>
+            <w:tcW w:type="dxa" w:w="2340"/>
+          </w:tcPr>
+          <w:p>
+            <w:r/>
+            <w:r>
+              <w:t>Override breakdown</w:t>
+            </w:r>
+          </w:p>
+        </w:tc>
+        <w:tc>
+          <w:tcPr>
+            <w:tcW w:type="dxa" w:w="2340"/>
+          </w:tcPr>
+          <w:p>
+            <w:r/>
+            <w:r>
+              <w:t>31 with explicit override, 809 with null</w:t>
+            </w:r>
+          </w:p>
+        </w:tc>
+        <w:tc>
+          <w:tcPr>
+            <w:tcW w:type="dxa" w:w="2340"/>
+          </w:tcPr>
+          <w:p>
+            <w:r/>
+            <w:r>
+              <w:t>31 / 809</w:t>
+            </w:r>
+          </w:p>
+        </w:tc>
+        <w:tc>
+          <w:tcPr>
+            <w:tcW w:type="dxa" w:w="2340"/>
+          </w:tcPr>
+          <w:p>
+            <w:r/>
+            <w:r>
+              <w:t>yes</w:t>
+            </w:r>
+          </w:p>
+        </w:tc>
+      </w:tr>
+      <w:tr>
+        <w:tc>
+          <w:tcPr>
+            <w:tcW w:type="dxa" w:w="2340"/>
+          </w:tcPr>
+          <w:p>
+            <w:r/>
+            <w:r>
+              <w:t>Round trip masked_text[s:e] equals text</w:t>
+            </w:r>
+          </w:p>
+        </w:tc>
+        <w:tc>
+          <w:tcPr>
+            <w:tcW w:type="dxa" w:w="2340"/>
+          </w:tcPr>
+          <w:p>
+            <w:r/>
+            <w:r>
+              <w:t>840 of 840 pass</w:t>
+            </w:r>
+          </w:p>
+        </w:tc>
+        <w:tc>
+          <w:tcPr>
+            <w:tcW w:type="dxa" w:w="2340"/>
+          </w:tcPr>
+          <w:p>
+            <w:r/>
+            <w:r>
+              <w:t>840 of 840 pass</w:t>
+            </w:r>
+          </w:p>
+        </w:tc>
+        <w:tc>
+          <w:tcPr>
+            <w:tcW w:type="dxa" w:w="2340"/>
+          </w:tcPr>
+          <w:p>
+            <w:r/>
+            <w:r>
+              <w:t>yes</w:t>
+            </w:r>
+          </w:p>
+        </w:tc>
+      </w:tr>
+      <w:tr>
+        <w:tc>
+          <w:tcPr>
+            <w:tcW w:type="dxa" w:w="2340"/>
+          </w:tcPr>
+          <w:p>
+            <w:r/>
+            <w:r>
+              <w:t>Duplicate spans across documents</w:t>
+            </w:r>
+          </w:p>
+        </w:tc>
+        <w:tc>
+          <w:tcPr>
+            <w:tcW w:type="dxa" w:w="2340"/>
+          </w:tcPr>
+          <w:p>
+            <w:r/>
+            <w:r>
+              <w:t>0</w:t>
+            </w:r>
+          </w:p>
+        </w:tc>
+        <w:tc>
+          <w:tcPr>
+            <w:tcW w:type="dxa" w:w="2340"/>
+          </w:tcPr>
+          <w:p>
+            <w:r/>
+            <w:r>
+              <w:t>0</w:t>
+            </w:r>
+          </w:p>
+        </w:tc>
+        <w:tc>
+          <w:tcPr>
+            <w:tcW w:type="dxa" w:w="2340"/>
+          </w:tcPr>
+          <w:p>
+            <w:r/>
+            <w:r>
+              <w:t>yes</w:t>
+            </w:r>
+          </w:p>
+        </w:tc>
+      </w:tr>
+      <w:tr>
+        <w:tc>
+          <w:tcPr>
+            <w:tcW w:type="dxa" w:w="2340"/>
+          </w:tcPr>
+          <w:p>
+            <w:r/>
+            <w:r>
+              <w:t>Overlap or nesting in retained set</w:t>
+            </w:r>
+          </w:p>
+        </w:tc>
+        <w:tc>
+          <w:tcPr>
+            <w:tcW w:type="dxa" w:w="2340"/>
+          </w:tcPr>
+          <w:p>
+            <w:r/>
+            <w:r>
+              <w:t>0 pairs</w:t>
+            </w:r>
+          </w:p>
+        </w:tc>
+        <w:tc>
+          <w:tcPr>
+            <w:tcW w:type="dxa" w:w="2340"/>
+          </w:tcPr>
+          <w:p>
+            <w:r/>
+            <w:r>
+              <w:t>0 pairs</w:t>
+            </w:r>
+          </w:p>
+        </w:tc>
+        <w:tc>
+          <w:tcPr>
+            <w:tcW w:type="dxa" w:w="2340"/>
+          </w:tcPr>
+          <w:p>
+            <w:r/>
+            <w:r>
+              <w:t>yes</w:t>
+            </w:r>
+          </w:p>
+        </w:tc>
+      </w:tr>
+      <w:tr>
+        <w:tc>
+          <w:tcPr>
+            <w:tcW w:type="dxa" w:w="2340"/>
+          </w:tcPr>
+          <w:p>
+            <w:r/>
+            <w:r>
+              <w:t>Per document masked text hash match</w:t>
+            </w:r>
+          </w:p>
+        </w:tc>
+        <w:tc>
+          <w:tcPr>
+            <w:tcW w:type="dxa" w:w="2340"/>
+          </w:tcPr>
+          <w:p>
+            <w:r/>
+            <w:r>
+              <w:t>25 of 25</w:t>
+            </w:r>
+          </w:p>
+        </w:tc>
+        <w:tc>
+          <w:tcPr>
+            <w:tcW w:type="dxa" w:w="2340"/>
+          </w:tcPr>
+          <w:p>
+            <w:r/>
+            <w:r>
+              <w:t>25 of 25</w:t>
+            </w:r>
+          </w:p>
+        </w:tc>
+        <w:tc>
+          <w:tcPr>
+            <w:tcW w:type="dxa" w:w="2340"/>
+          </w:tcPr>
+          <w:p>
+            <w:r/>
+            <w:r>
+              <w:t>yes</w:t>
+            </w:r>
+          </w:p>
+        </w:tc>
+      </w:tr>
+      <w:tr>
+        <w:tc>
+          <w:tcPr>
+            <w:tcW w:type="dxa" w:w="2340"/>
+          </w:tcPr>
+          <w:p>
+            <w:r/>
+            <w:r>
+              <w:t>Forbidden source key deep walk on every emitted JSON</w:t>
+            </w:r>
+          </w:p>
+        </w:tc>
+        <w:tc>
+          <w:tcPr>
+            <w:tcW w:type="dxa" w:w="2340"/>
+          </w:tcPr>
+          <w:p>
+            <w:r/>
+            <w:r>
+              <w:t>0 hits</w:t>
+            </w:r>
+          </w:p>
+        </w:tc>
+        <w:tc>
+          <w:tcPr>
+            <w:tcW w:type="dxa" w:w="2340"/>
+          </w:tcPr>
+          <w:p>
+            <w:r/>
+            <w:r>
+              <w:t>0 hits</w:t>
+            </w:r>
+          </w:p>
+        </w:tc>
+        <w:tc>
+          <w:tcPr>
+            <w:tcW w:type="dxa" w:w="2340"/>
+          </w:tcPr>
+          <w:p>
+            <w:r/>
+            <w:r>
+              <w:t>yes</w:t>
+            </w:r>
+          </w:p>
+        </w:tc>
+      </w:tr>
+      <w:tr>
+        <w:tc>
+          <w:tcPr>
+            <w:tcW w:type="dxa" w:w="2340"/>
+          </w:tcPr>
+          <w:p>
+            <w:r/>
+            <w:r>
+              <w:t>Schema version</w:t>
+            </w:r>
+          </w:p>
+        </w:tc>
+        <w:tc>
+          <w:tcPr>
+            <w:tcW w:type="dxa" w:w="2340"/>
+          </w:tcPr>
+          <w:p>
+            <w:r/>
+            <w:r>
+              <w:t>v7 (10 labels)</w:t>
+            </w:r>
+          </w:p>
+        </w:tc>
+        <w:tc>
+          <w:tcPr>
+            <w:tcW w:type="dxa" w:w="2340"/>
+          </w:tcPr>
+          <w:p>
+            <w:r/>
+            <w:r>
+              <w:t>v7 (10 labels)</w:t>
+            </w:r>
+          </w:p>
+        </w:tc>
+        <w:tc>
+          <w:tcPr>
+            <w:tcW w:type="dxa" w:w="2340"/>
+          </w:tcPr>
+          <w:p>
+            <w:r/>
+            <w:r>
+              <w:t>yes</w:t>
+            </w:r>
+          </w:p>
+        </w:tc>
+      </w:tr>
+      <w:tr>
+        <w:tc>
+          <w:tcPr>
+            <w:tcW w:type="dxa" w:w="2340"/>
+          </w:tcPr>
+          <w:p>
+            <w:r/>
+            <w:r>
+              <w:t>Blind set discipline</w:t>
+            </w:r>
+          </w:p>
+        </w:tc>
+        <w:tc>
+          <w:tcPr>
+            <w:tcW w:type="dxa" w:w="2340"/>
+          </w:tcPr>
+          <w:p>
+            <w:r/>
+            <w:r>
+              <w:t>never opened, read, stat'd, or hashed</w:t>
+            </w:r>
+          </w:p>
+        </w:tc>
+        <w:tc>
+          <w:tcPr>
+            <w:tcW w:type="dxa" w:w="2340"/>
+          </w:tcPr>
+          <w:p>
+            <w:r/>
+            <w:r>
+              <w:t>confirmed</w:t>
+            </w:r>
+          </w:p>
+        </w:tc>
+        <w:tc>
+          <w:tcPr>
+            <w:tcW w:type="dxa" w:w="2340"/>
+          </w:tcPr>
+          <w:p>
+            <w:r/>
+            <w:r>
+              <w:t>yes</w:t>
+            </w:r>
+          </w:p>
+        </w:tc>
+      </w:tr>
+    </w:tbl>
+    <w:p/>
+    <w:p>
+      <w:pPr>
+        <w:spacing w:after="120"/>
+        <w:jc w:val="left"/>
+      </w:pPr>
+      <w:r>
+        <w:t>The reason this matters for an HR system is the same reason it matters for any high risk AI deployment. A hire or do not advance recommendation is contestable. When a department head, an internal auditor, or a labor relations attorney asks "how do I know the model is right", the answer needs to be more than "trust the model". Every evaluation number cited in the dashboard or in a brain memo traces back to a specific span in this canonical sidecar, with its review history attached. The integrity bracket above is the receipt.</w:t>
+      </w:r>
+    </w:p>
+    <w:p>
+      <w:pPr>
+        <w:pStyle w:val="Heading2"/>
+        <w:spacing w:before="160" w:after="40"/>
+      </w:pPr>
+      <w:r>
+        <w:t>6. What worked, what did not, and the surprising thing I learned</w:t>
       </w:r>
     </w:p>
     <w:p>
@@ -724,7 +1534,7 @@
         <w:spacing w:before="160" w:after="40"/>
       </w:pPr>
       <w:r>
-        <w:t>6. What I would build next with another semester</w:t>
+        <w:t>7. What I would build next with another semester</w:t>
       </w:r>
     </w:p>
     <w:p>

</xml_diff>